<commit_message>
Finish changing from Collections to HTMLBlocks.
</commit_message>
<xml_diff>
--- a/Documentation/HTMLBlock.docx
+++ b/Documentation/HTMLBlock.docx
@@ -987,12 +987,12 @@
       <w:pPr>
         <w:pStyle w:val="Heading2"/>
       </w:pPr>
-      <w:bookmarkStart w:id="2" w:name="_Toc237788081"/>
-      <w:bookmarkStart w:id="3" w:name="_Toc242628103"/>
+      <w:bookmarkStart w:id="2" w:name="_Toc242628103"/>
+      <w:bookmarkStart w:id="3" w:name="_Toc237788081"/>
       <w:r>
         <w:t>HTML Blocks</w:t>
       </w:r>
-      <w:bookmarkEnd w:id="3"/>
+      <w:bookmarkEnd w:id="2"/>
     </w:p>
     <w:p>
       <w:pPr>
@@ -1135,7 +1135,7 @@
       <w:r>
         <w:t>blockName-uid-fieldName</w:t>
       </w:r>
-      <w:bookmarkEnd w:id="2"/>
+      <w:bookmarkEnd w:id="3"/>
       <w:proofErr w:type="spellEnd"/>
       <w:proofErr w:type="gramEnd"/>
     </w:p>
@@ -1591,13 +1591,20 @@
       <w:pPr>
         <w:pStyle w:val="SourceCode"/>
       </w:pPr>
-      <w:proofErr w:type="gramStart"/>
-      <w:r>
-        <w:t>const</w:t>
-      </w:r>
-      <w:proofErr w:type="gramEnd"/>
-      <w:r>
-        <w:t xml:space="preserve"> f1099g = new F1099G();</w:t>
+      <w:r>
+        <w:t xml:space="preserve">const f1099g = new </w:t>
+      </w:r>
+      <w:r>
+        <w:t>W1099G</w:t>
+      </w:r>
+      <w:r>
+        <w:t>(</w:t>
+      </w:r>
+      <w:r>
+        <w:t>F1099G, “f1099g”</w:t>
+      </w:r>
+      <w:r>
+        <w:t>);</w:t>
       </w:r>
     </w:p>
     <w:p>
@@ -5851,7 +5858,7 @@
 </file>
 
 <file path=customXml/itemProps1.xml><?xml version="1.0" encoding="utf-8"?>
-<ds:datastoreItem xmlns:ds="http://schemas.openxmlformats.org/officeDocument/2006/customXml" ds:itemID="{B945F873-5FAC-491C-9023-734F3B981D22}">
+<ds:datastoreItem xmlns:ds="http://schemas.openxmlformats.org/officeDocument/2006/customXml" ds:itemID="{D08DCA75-9DC5-4406-9D01-F6E1EF20CC31}">
   <ds:schemaRefs>
     <ds:schemaRef ds:uri="http://schemas.openxmlformats.org/officeDocument/2006/bibliography"/>
   </ds:schemaRefs>

</xml_diff>